<commit_message>
feat: add sequence columns to interview reports
</commit_message>
<xml_diff>
--- a/generating-patient-full-course-data/assets/patient-interview-analysis-template.docx
+++ b/generating-patient-full-course-data/assets/patient-interview-analysis-template.docx
@@ -217,12 +217,42 @@
         </w:tblCellMar>
       </w:tblPr>
       <w:tblGrid>
-        <w:gridCol w:w="1164"/>
-        <w:gridCol w:w="1457"/>
-        <w:gridCol w:w="1741"/>
-        <w:gridCol w:w="4684"/>
+        <w:gridCol w:w="520"/>
+        <w:gridCol w:w="1097"/>
+        <w:gridCol w:w="1373"/>
+        <w:gridCol w:w="1641"/>
+        <w:gridCol w:w="4415"/>
       </w:tblGrid>
       <w:tr>
+        <w:tc>
+          <w:tcPr>
+            <w:tcW w:w="520" w:type="dxa"/>
+            <w:tcBorders>
+              <w:top w:val="single" w:color="000000" w:sz="0" w:space="0"/>
+              <w:left w:val="single" w:color="000000" w:sz="0" w:space="0"/>
+              <w:bottom w:val="single" w:color="000000" w:sz="0" w:space="0"/>
+              <w:right w:val="single" w:color="000000" w:sz="0" w:space="0"/>
+            </w:tcBorders>
+            <w:shd w:val="clear" w:color="auto" w:fill="D9E2F3"/>
+            <w:vAlign w:val="center"/>
+          </w:tcPr>
+          <w:p>
+            <w:pPr>
+              <w:spacing w:line="560" w:lineRule="exact"/>
+              <w:jc w:val="center"/>
+            </w:pPr>
+            <w:r>
+              <w:rPr>
+                <w:rFonts w:ascii="黑体" w:hAnsi="黑体" w:eastAsia="黑体" w:cs="黑体"/>
+                <w:b/>
+                <w:bCs/>
+                <w:sz w:val="24"/>
+                <w:szCs w:val="24"/>
+              </w:rPr>
+              <w:t xml:space="preserve">序号</w:t>
+            </w:r>
+          </w:p>
+        </w:tc>
         <w:tblPrEx>
           <w:tblBorders>
             <w:top w:val="single" w:color="auto" w:sz="4" w:space="0"/>
@@ -244,7 +274,7 @@
         </w:trPr>
         <w:tc>
           <w:tcPr>
-            <w:tcW w:w="1200" w:type="dxa"/>
+            <w:tcW w:w="1097" w:type="dxa"/>
             <w:tcBorders>
               <w:top w:val="single" w:color="000000" w:sz="0" w:space="0"/>
               <w:left w:val="single" w:color="000000" w:sz="0" w:space="0"/>
@@ -273,7 +303,7 @@
         </w:tc>
         <w:tc>
           <w:tcPr>
-            <w:tcW w:w="1500" w:type="dxa"/>
+            <w:tcW w:w="1373" w:type="dxa"/>
             <w:tcBorders>
               <w:top w:val="single" w:color="000000" w:sz="0" w:space="0"/>
               <w:left w:val="single" w:color="000000" w:sz="0" w:space="0"/>
@@ -302,7 +332,7 @@
         </w:tc>
         <w:tc>
           <w:tcPr>
-            <w:tcW w:w="1800" w:type="dxa"/>
+            <w:tcW w:w="1641" w:type="dxa"/>
             <w:tcBorders>
               <w:top w:val="single" w:color="000000" w:sz="0" w:space="0"/>
               <w:left w:val="single" w:color="000000" w:sz="0" w:space="0"/>
@@ -331,7 +361,7 @@
         </w:tc>
         <w:tc>
           <w:tcPr>
-            <w:tcW w:w="4860" w:type="dxa"/>
+            <w:tcW w:w="4415" w:type="dxa"/>
             <w:tcBorders>
               <w:top w:val="single" w:color="000000" w:sz="0" w:space="0"/>
               <w:left w:val="single" w:color="000000" w:sz="0" w:space="0"/>
@@ -360,6 +390,32 @@
         </w:tc>
       </w:tr>
       <w:tr>
+        <w:tc>
+          <w:tcPr>
+            <w:tcW w:w="520" w:type="dxa"/>
+            <w:tcBorders>
+              <w:top w:val="single" w:color="000000" w:sz="0" w:space="0"/>
+              <w:left w:val="single" w:color="000000" w:sz="0" w:space="0"/>
+              <w:bottom w:val="single" w:color="000000" w:sz="0" w:space="0"/>
+              <w:right w:val="single" w:color="000000" w:sz="0" w:space="0"/>
+            </w:tcBorders>
+            <w:vAlign w:val="center"/>
+          </w:tcPr>
+          <w:p>
+            <w:pPr>
+              <w:spacing w:line="560" w:lineRule="exact"/>
+              <w:jc w:val="center"/>
+            </w:pPr>
+            <w:r>
+              <w:rPr>
+                <w:rFonts w:ascii="宋体" w:hAnsi="宋体" w:eastAsia="宋体" w:cs="宋体"/>
+                <w:sz w:val="24"/>
+                <w:szCs w:val="24"/>
+              </w:rPr>
+              <w:t xml:space="preserve">1</w:t>
+            </w:r>
+          </w:p>
+        </w:tc>
         <w:tblPrEx>
           <w:tblBorders>
             <w:top w:val="single" w:color="auto" w:sz="4" w:space="0"/>
@@ -378,7 +434,7 @@
         </w:tblPrEx>
         <w:tc>
           <w:tcPr>
-            <w:tcW w:w="1200" w:type="dxa"/>
+            <w:tcW w:w="1097" w:type="dxa"/>
             <w:tcBorders>
               <w:top w:val="single" w:color="000000" w:sz="0" w:space="0"/>
               <w:left w:val="single" w:color="000000" w:sz="0" w:space="0"/>
@@ -404,7 +460,7 @@
         </w:tc>
         <w:tc>
           <w:tcPr>
-            <w:tcW w:w="1500" w:type="dxa"/>
+            <w:tcW w:w="1373" w:type="dxa"/>
             <w:tcBorders>
               <w:top w:val="single" w:color="000000" w:sz="0" w:space="0"/>
               <w:left w:val="single" w:color="000000" w:sz="0" w:space="0"/>
@@ -430,7 +486,7 @@
         </w:tc>
         <w:tc>
           <w:tcPr>
-            <w:tcW w:w="1800" w:type="dxa"/>
+            <w:tcW w:w="1641" w:type="dxa"/>
             <w:tcBorders>
               <w:top w:val="single" w:color="000000" w:sz="0" w:space="0"/>
               <w:left w:val="single" w:color="000000" w:sz="0" w:space="0"/>
@@ -456,7 +512,7 @@
         </w:tc>
         <w:tc>
           <w:tcPr>
-            <w:tcW w:w="4860" w:type="dxa"/>
+            <w:tcW w:w="4415" w:type="dxa"/>
             <w:tcBorders>
               <w:top w:val="single" w:color="000000" w:sz="0" w:space="0"/>
               <w:left w:val="single" w:color="000000" w:sz="0" w:space="0"/>
@@ -482,6 +538,32 @@
         </w:tc>
       </w:tr>
       <w:tr>
+        <w:tc>
+          <w:tcPr>
+            <w:tcW w:w="520" w:type="dxa"/>
+            <w:tcBorders>
+              <w:top w:val="single" w:color="000000" w:sz="0" w:space="0"/>
+              <w:left w:val="single" w:color="000000" w:sz="0" w:space="0"/>
+              <w:bottom w:val="single" w:color="000000" w:sz="0" w:space="0"/>
+              <w:right w:val="single" w:color="000000" w:sz="0" w:space="0"/>
+            </w:tcBorders>
+            <w:vAlign w:val="center"/>
+          </w:tcPr>
+          <w:p>
+            <w:pPr>
+              <w:spacing w:line="560" w:lineRule="exact"/>
+              <w:jc w:val="center"/>
+            </w:pPr>
+            <w:r>
+              <w:rPr>
+                <w:rFonts w:ascii="宋体" w:hAnsi="宋体" w:eastAsia="宋体" w:cs="宋体"/>
+                <w:sz w:val="24"/>
+                <w:szCs w:val="24"/>
+              </w:rPr>
+              <w:t xml:space="preserve">2</w:t>
+            </w:r>
+          </w:p>
+        </w:tc>
         <w:tblPrEx>
           <w:tblBorders>
             <w:top w:val="single" w:color="auto" w:sz="4" w:space="0"/>
@@ -500,7 +582,7 @@
         </w:tblPrEx>
         <w:tc>
           <w:tcPr>
-            <w:tcW w:w="1200" w:type="dxa"/>
+            <w:tcW w:w="1097" w:type="dxa"/>
             <w:tcBorders>
               <w:top w:val="single" w:color="000000" w:sz="0" w:space="0"/>
               <w:left w:val="single" w:color="000000" w:sz="0" w:space="0"/>
@@ -526,7 +608,7 @@
         </w:tc>
         <w:tc>
           <w:tcPr>
-            <w:tcW w:w="1500" w:type="dxa"/>
+            <w:tcW w:w="1373" w:type="dxa"/>
             <w:tcBorders>
               <w:top w:val="single" w:color="000000" w:sz="0" w:space="0"/>
               <w:left w:val="single" w:color="000000" w:sz="0" w:space="0"/>
@@ -552,7 +634,7 @@
         </w:tc>
         <w:tc>
           <w:tcPr>
-            <w:tcW w:w="1800" w:type="dxa"/>
+            <w:tcW w:w="1641" w:type="dxa"/>
             <w:tcBorders>
               <w:top w:val="single" w:color="000000" w:sz="0" w:space="0"/>
               <w:left w:val="single" w:color="000000" w:sz="0" w:space="0"/>
@@ -578,7 +660,7 @@
         </w:tc>
         <w:tc>
           <w:tcPr>
-            <w:tcW w:w="4860" w:type="dxa"/>
+            <w:tcW w:w="4415" w:type="dxa"/>
             <w:tcBorders>
               <w:top w:val="single" w:color="000000" w:sz="0" w:space="0"/>
               <w:left w:val="single" w:color="000000" w:sz="0" w:space="0"/>
@@ -604,6 +686,32 @@
         </w:tc>
       </w:tr>
       <w:tr>
+        <w:tc>
+          <w:tcPr>
+            <w:tcW w:w="520" w:type="dxa"/>
+            <w:tcBorders>
+              <w:top w:val="single" w:color="000000" w:sz="0" w:space="0"/>
+              <w:left w:val="single" w:color="000000" w:sz="0" w:space="0"/>
+              <w:bottom w:val="single" w:color="000000" w:sz="0" w:space="0"/>
+              <w:right w:val="single" w:color="000000" w:sz="0" w:space="0"/>
+            </w:tcBorders>
+            <w:vAlign w:val="center"/>
+          </w:tcPr>
+          <w:p>
+            <w:pPr>
+              <w:spacing w:line="560" w:lineRule="exact"/>
+              <w:jc w:val="center"/>
+            </w:pPr>
+            <w:r>
+              <w:rPr>
+                <w:rFonts w:ascii="宋体" w:hAnsi="宋体" w:eastAsia="宋体" w:cs="宋体"/>
+                <w:sz w:val="24"/>
+                <w:szCs w:val="24"/>
+              </w:rPr>
+              <w:t xml:space="preserve">3</w:t>
+            </w:r>
+          </w:p>
+        </w:tc>
         <w:tblPrEx>
           <w:tblBorders>
             <w:top w:val="single" w:color="auto" w:sz="4" w:space="0"/>
@@ -622,7 +730,7 @@
         </w:tblPrEx>
         <w:tc>
           <w:tcPr>
-            <w:tcW w:w="1200" w:type="dxa"/>
+            <w:tcW w:w="1097" w:type="dxa"/>
             <w:tcBorders>
               <w:top w:val="single" w:color="000000" w:sz="0" w:space="0"/>
               <w:left w:val="single" w:color="000000" w:sz="0" w:space="0"/>
@@ -648,7 +756,7 @@
         </w:tc>
         <w:tc>
           <w:tcPr>
-            <w:tcW w:w="1500" w:type="dxa"/>
+            <w:tcW w:w="1373" w:type="dxa"/>
             <w:tcBorders>
               <w:top w:val="single" w:color="000000" w:sz="0" w:space="0"/>
               <w:left w:val="single" w:color="000000" w:sz="0" w:space="0"/>
@@ -674,7 +782,7 @@
         </w:tc>
         <w:tc>
           <w:tcPr>
-            <w:tcW w:w="1800" w:type="dxa"/>
+            <w:tcW w:w="1641" w:type="dxa"/>
             <w:tcBorders>
               <w:top w:val="single" w:color="000000" w:sz="0" w:space="0"/>
               <w:left w:val="single" w:color="000000" w:sz="0" w:space="0"/>
@@ -700,7 +808,7 @@
         </w:tc>
         <w:tc>
           <w:tcPr>
-            <w:tcW w:w="4860" w:type="dxa"/>
+            <w:tcW w:w="4415" w:type="dxa"/>
             <w:tcBorders>
               <w:top w:val="single" w:color="000000" w:sz="0" w:space="0"/>
               <w:left w:val="single" w:color="000000" w:sz="0" w:space="0"/>
@@ -726,6 +834,32 @@
         </w:tc>
       </w:tr>
       <w:tr>
+        <w:tc>
+          <w:tcPr>
+            <w:tcW w:w="520" w:type="dxa"/>
+            <w:tcBorders>
+              <w:top w:val="single" w:color="000000" w:sz="0" w:space="0"/>
+              <w:left w:val="single" w:color="000000" w:sz="0" w:space="0"/>
+              <w:bottom w:val="single" w:color="000000" w:sz="0" w:space="0"/>
+              <w:right w:val="single" w:color="000000" w:sz="0" w:space="0"/>
+            </w:tcBorders>
+            <w:vAlign w:val="center"/>
+          </w:tcPr>
+          <w:p>
+            <w:pPr>
+              <w:spacing w:line="560" w:lineRule="exact"/>
+              <w:jc w:val="center"/>
+            </w:pPr>
+            <w:r>
+              <w:rPr>
+                <w:rFonts w:ascii="宋体" w:hAnsi="宋体" w:eastAsia="宋体" w:cs="宋体"/>
+                <w:sz w:val="24"/>
+                <w:szCs w:val="24"/>
+              </w:rPr>
+              <w:t xml:space="preserve">4</w:t>
+            </w:r>
+          </w:p>
+        </w:tc>
         <w:tblPrEx>
           <w:tblBorders>
             <w:top w:val="single" w:color="auto" w:sz="4" w:space="0"/>
@@ -744,7 +878,7 @@
         </w:tblPrEx>
         <w:tc>
           <w:tcPr>
-            <w:tcW w:w="1200" w:type="dxa"/>
+            <w:tcW w:w="1097" w:type="dxa"/>
             <w:tcBorders>
               <w:top w:val="single" w:color="000000" w:sz="0" w:space="0"/>
               <w:left w:val="single" w:color="000000" w:sz="0" w:space="0"/>
@@ -770,7 +904,7 @@
         </w:tc>
         <w:tc>
           <w:tcPr>
-            <w:tcW w:w="1500" w:type="dxa"/>
+            <w:tcW w:w="1373" w:type="dxa"/>
             <w:tcBorders>
               <w:top w:val="single" w:color="000000" w:sz="0" w:space="0"/>
               <w:left w:val="single" w:color="000000" w:sz="0" w:space="0"/>
@@ -796,7 +930,7 @@
         </w:tc>
         <w:tc>
           <w:tcPr>
-            <w:tcW w:w="1800" w:type="dxa"/>
+            <w:tcW w:w="1641" w:type="dxa"/>
             <w:tcBorders>
               <w:top w:val="single" w:color="000000" w:sz="0" w:space="0"/>
               <w:left w:val="single" w:color="000000" w:sz="0" w:space="0"/>
@@ -822,7 +956,7 @@
         </w:tc>
         <w:tc>
           <w:tcPr>
-            <w:tcW w:w="4860" w:type="dxa"/>
+            <w:tcW w:w="4415" w:type="dxa"/>
             <w:tcBorders>
               <w:top w:val="single" w:color="000000" w:sz="0" w:space="0"/>
               <w:left w:val="single" w:color="000000" w:sz="0" w:space="0"/>
@@ -848,6 +982,32 @@
         </w:tc>
       </w:tr>
       <w:tr>
+        <w:tc>
+          <w:tcPr>
+            <w:tcW w:w="520" w:type="dxa"/>
+            <w:tcBorders>
+              <w:top w:val="single" w:color="000000" w:sz="0" w:space="0"/>
+              <w:left w:val="single" w:color="000000" w:sz="0" w:space="0"/>
+              <w:bottom w:val="single" w:color="000000" w:sz="0" w:space="0"/>
+              <w:right w:val="single" w:color="000000" w:sz="0" w:space="0"/>
+            </w:tcBorders>
+            <w:vAlign w:val="center"/>
+          </w:tcPr>
+          <w:p>
+            <w:pPr>
+              <w:spacing w:line="560" w:lineRule="exact"/>
+              <w:jc w:val="center"/>
+            </w:pPr>
+            <w:r>
+              <w:rPr>
+                <w:rFonts w:ascii="宋体" w:hAnsi="宋体" w:eastAsia="宋体" w:cs="宋体"/>
+                <w:sz w:val="24"/>
+                <w:szCs w:val="24"/>
+              </w:rPr>
+              <w:t xml:space="preserve">5</w:t>
+            </w:r>
+          </w:p>
+        </w:tc>
         <w:tblPrEx>
           <w:tblBorders>
             <w:top w:val="single" w:color="auto" w:sz="4" w:space="0"/>
@@ -866,7 +1026,7 @@
         </w:tblPrEx>
         <w:tc>
           <w:tcPr>
-            <w:tcW w:w="1200" w:type="dxa"/>
+            <w:tcW w:w="1097" w:type="dxa"/>
             <w:tcBorders>
               <w:top w:val="single" w:color="000000" w:sz="0" w:space="0"/>
               <w:left w:val="single" w:color="000000" w:sz="0" w:space="0"/>
@@ -892,7 +1052,7 @@
         </w:tc>
         <w:tc>
           <w:tcPr>
-            <w:tcW w:w="1500" w:type="dxa"/>
+            <w:tcW w:w="1373" w:type="dxa"/>
             <w:tcBorders>
               <w:top w:val="single" w:color="000000" w:sz="0" w:space="0"/>
               <w:left w:val="single" w:color="000000" w:sz="0" w:space="0"/>
@@ -918,7 +1078,7 @@
         </w:tc>
         <w:tc>
           <w:tcPr>
-            <w:tcW w:w="1800" w:type="dxa"/>
+            <w:tcW w:w="1641" w:type="dxa"/>
             <w:tcBorders>
               <w:top w:val="single" w:color="000000" w:sz="0" w:space="0"/>
               <w:left w:val="single" w:color="000000" w:sz="0" w:space="0"/>
@@ -944,7 +1104,7 @@
         </w:tc>
         <w:tc>
           <w:tcPr>
-            <w:tcW w:w="4860" w:type="dxa"/>
+            <w:tcW w:w="4415" w:type="dxa"/>
             <w:tcBorders>
               <w:top w:val="single" w:color="000000" w:sz="0" w:space="0"/>
               <w:left w:val="single" w:color="000000" w:sz="0" w:space="0"/>
@@ -970,6 +1130,32 @@
         </w:tc>
       </w:tr>
       <w:tr>
+        <w:tc>
+          <w:tcPr>
+            <w:tcW w:w="520" w:type="dxa"/>
+            <w:tcBorders>
+              <w:top w:val="single" w:color="000000" w:sz="0" w:space="0"/>
+              <w:left w:val="single" w:color="000000" w:sz="0" w:space="0"/>
+              <w:bottom w:val="single" w:color="000000" w:sz="0" w:space="0"/>
+              <w:right w:val="single" w:color="000000" w:sz="0" w:space="0"/>
+            </w:tcBorders>
+            <w:vAlign w:val="center"/>
+          </w:tcPr>
+          <w:p>
+            <w:pPr>
+              <w:spacing w:line="560" w:lineRule="exact"/>
+              <w:jc w:val="center"/>
+            </w:pPr>
+            <w:r>
+              <w:rPr>
+                <w:rFonts w:ascii="宋体" w:hAnsi="宋体" w:eastAsia="宋体" w:cs="宋体"/>
+                <w:sz w:val="24"/>
+                <w:szCs w:val="24"/>
+              </w:rPr>
+              <w:t xml:space="preserve">6</w:t>
+            </w:r>
+          </w:p>
+        </w:tc>
         <w:tblPrEx>
           <w:tblBorders>
             <w:top w:val="single" w:color="auto" w:sz="4" w:space="0"/>
@@ -988,7 +1174,7 @@
         </w:tblPrEx>
         <w:tc>
           <w:tcPr>
-            <w:tcW w:w="1200" w:type="dxa"/>
+            <w:tcW w:w="1097" w:type="dxa"/>
             <w:tcBorders>
               <w:top w:val="single" w:color="000000" w:sz="0" w:space="0"/>
               <w:left w:val="single" w:color="000000" w:sz="0" w:space="0"/>
@@ -1014,7 +1200,7 @@
         </w:tc>
         <w:tc>
           <w:tcPr>
-            <w:tcW w:w="1500" w:type="dxa"/>
+            <w:tcW w:w="1373" w:type="dxa"/>
             <w:tcBorders>
               <w:top w:val="single" w:color="000000" w:sz="0" w:space="0"/>
               <w:left w:val="single" w:color="000000" w:sz="0" w:space="0"/>
@@ -1040,7 +1226,7 @@
         </w:tc>
         <w:tc>
           <w:tcPr>
-            <w:tcW w:w="1800" w:type="dxa"/>
+            <w:tcW w:w="1641" w:type="dxa"/>
             <w:tcBorders>
               <w:top w:val="single" w:color="000000" w:sz="0" w:space="0"/>
               <w:left w:val="single" w:color="000000" w:sz="0" w:space="0"/>
@@ -1066,7 +1252,7 @@
         </w:tc>
         <w:tc>
           <w:tcPr>
-            <w:tcW w:w="4860" w:type="dxa"/>
+            <w:tcW w:w="4415" w:type="dxa"/>
             <w:tcBorders>
               <w:top w:val="single" w:color="000000" w:sz="0" w:space="0"/>
               <w:left w:val="single" w:color="000000" w:sz="0" w:space="0"/>
@@ -1092,6 +1278,32 @@
         </w:tc>
       </w:tr>
       <w:tr>
+        <w:tc>
+          <w:tcPr>
+            <w:tcW w:w="520" w:type="dxa"/>
+            <w:tcBorders>
+              <w:top w:val="single" w:color="000000" w:sz="0" w:space="0"/>
+              <w:left w:val="single" w:color="000000" w:sz="0" w:space="0"/>
+              <w:bottom w:val="single" w:color="000000" w:sz="0" w:space="0"/>
+              <w:right w:val="single" w:color="000000" w:sz="0" w:space="0"/>
+            </w:tcBorders>
+            <w:vAlign w:val="center"/>
+          </w:tcPr>
+          <w:p>
+            <w:pPr>
+              <w:spacing w:line="560" w:lineRule="exact"/>
+              <w:jc w:val="center"/>
+            </w:pPr>
+            <w:r>
+              <w:rPr>
+                <w:rFonts w:ascii="宋体" w:hAnsi="宋体" w:eastAsia="宋体" w:cs="宋体"/>
+                <w:sz w:val="24"/>
+                <w:szCs w:val="24"/>
+              </w:rPr>
+              <w:t xml:space="preserve">7</w:t>
+            </w:r>
+          </w:p>
+        </w:tc>
         <w:tblPrEx>
           <w:tblBorders>
             <w:top w:val="single" w:color="auto" w:sz="4" w:space="0"/>
@@ -1110,7 +1322,7 @@
         </w:tblPrEx>
         <w:tc>
           <w:tcPr>
-            <w:tcW w:w="1200" w:type="dxa"/>
+            <w:tcW w:w="1097" w:type="dxa"/>
             <w:tcBorders>
               <w:top w:val="single" w:color="000000" w:sz="0" w:space="0"/>
               <w:left w:val="single" w:color="000000" w:sz="0" w:space="0"/>
@@ -1136,7 +1348,7 @@
         </w:tc>
         <w:tc>
           <w:tcPr>
-            <w:tcW w:w="1500" w:type="dxa"/>
+            <w:tcW w:w="1373" w:type="dxa"/>
             <w:tcBorders>
               <w:top w:val="single" w:color="000000" w:sz="0" w:space="0"/>
               <w:left w:val="single" w:color="000000" w:sz="0" w:space="0"/>
@@ -1162,7 +1374,7 @@
         </w:tc>
         <w:tc>
           <w:tcPr>
-            <w:tcW w:w="1800" w:type="dxa"/>
+            <w:tcW w:w="1641" w:type="dxa"/>
             <w:tcBorders>
               <w:top w:val="single" w:color="000000" w:sz="0" w:space="0"/>
               <w:left w:val="single" w:color="000000" w:sz="0" w:space="0"/>
@@ -1188,7 +1400,7 @@
         </w:tc>
         <w:tc>
           <w:tcPr>
-            <w:tcW w:w="4860" w:type="dxa"/>
+            <w:tcW w:w="4415" w:type="dxa"/>
             <w:tcBorders>
               <w:top w:val="single" w:color="000000" w:sz="0" w:space="0"/>
               <w:left w:val="single" w:color="000000" w:sz="0" w:space="0"/>
@@ -1214,6 +1426,32 @@
         </w:tc>
       </w:tr>
       <w:tr>
+        <w:tc>
+          <w:tcPr>
+            <w:tcW w:w="520" w:type="dxa"/>
+            <w:tcBorders>
+              <w:top w:val="single" w:color="000000" w:sz="0" w:space="0"/>
+              <w:left w:val="single" w:color="000000" w:sz="0" w:space="0"/>
+              <w:bottom w:val="single" w:color="000000" w:sz="0" w:space="0"/>
+              <w:right w:val="single" w:color="000000" w:sz="0" w:space="0"/>
+            </w:tcBorders>
+            <w:vAlign w:val="center"/>
+          </w:tcPr>
+          <w:p>
+            <w:pPr>
+              <w:spacing w:line="560" w:lineRule="exact"/>
+              <w:jc w:val="center"/>
+            </w:pPr>
+            <w:r>
+              <w:rPr>
+                <w:rFonts w:ascii="宋体" w:hAnsi="宋体" w:eastAsia="宋体" w:cs="宋体"/>
+                <w:sz w:val="24"/>
+                <w:szCs w:val="24"/>
+              </w:rPr>
+              <w:t xml:space="preserve">8</w:t>
+            </w:r>
+          </w:p>
+        </w:tc>
         <w:tblPrEx>
           <w:tblBorders>
             <w:top w:val="single" w:color="auto" w:sz="4" w:space="0"/>
@@ -1232,7 +1470,7 @@
         </w:tblPrEx>
         <w:tc>
           <w:tcPr>
-            <w:tcW w:w="1200" w:type="dxa"/>
+            <w:tcW w:w="1097" w:type="dxa"/>
             <w:tcBorders>
               <w:top w:val="single" w:color="000000" w:sz="0" w:space="0"/>
               <w:left w:val="single" w:color="000000" w:sz="0" w:space="0"/>
@@ -1258,7 +1496,7 @@
         </w:tc>
         <w:tc>
           <w:tcPr>
-            <w:tcW w:w="1500" w:type="dxa"/>
+            <w:tcW w:w="1373" w:type="dxa"/>
             <w:tcBorders>
               <w:top w:val="single" w:color="000000" w:sz="0" w:space="0"/>
               <w:left w:val="single" w:color="000000" w:sz="0" w:space="0"/>
@@ -1284,7 +1522,7 @@
         </w:tc>
         <w:tc>
           <w:tcPr>
-            <w:tcW w:w="1800" w:type="dxa"/>
+            <w:tcW w:w="1641" w:type="dxa"/>
             <w:tcBorders>
               <w:top w:val="single" w:color="000000" w:sz="0" w:space="0"/>
               <w:left w:val="single" w:color="000000" w:sz="0" w:space="0"/>
@@ -1310,7 +1548,7 @@
         </w:tc>
         <w:tc>
           <w:tcPr>
-            <w:tcW w:w="4860" w:type="dxa"/>
+            <w:tcW w:w="4415" w:type="dxa"/>
             <w:tcBorders>
               <w:top w:val="single" w:color="000000" w:sz="0" w:space="0"/>
               <w:left w:val="single" w:color="000000" w:sz="0" w:space="0"/>
@@ -1336,6 +1574,32 @@
         </w:tc>
       </w:tr>
       <w:tr>
+        <w:tc>
+          <w:tcPr>
+            <w:tcW w:w="520" w:type="dxa"/>
+            <w:tcBorders>
+              <w:top w:val="single" w:color="000000" w:sz="0" w:space="0"/>
+              <w:left w:val="single" w:color="000000" w:sz="0" w:space="0"/>
+              <w:bottom w:val="single" w:color="000000" w:sz="0" w:space="0"/>
+              <w:right w:val="single" w:color="000000" w:sz="0" w:space="0"/>
+            </w:tcBorders>
+            <w:vAlign w:val="center"/>
+          </w:tcPr>
+          <w:p>
+            <w:pPr>
+              <w:spacing w:line="560" w:lineRule="exact"/>
+              <w:jc w:val="center"/>
+            </w:pPr>
+            <w:r>
+              <w:rPr>
+                <w:rFonts w:ascii="宋体" w:hAnsi="宋体" w:eastAsia="宋体" w:cs="宋体"/>
+                <w:sz w:val="24"/>
+                <w:szCs w:val="24"/>
+              </w:rPr>
+              <w:t xml:space="preserve">9</w:t>
+            </w:r>
+          </w:p>
+        </w:tc>
         <w:tblPrEx>
           <w:tblBorders>
             <w:top w:val="single" w:color="auto" w:sz="4" w:space="0"/>
@@ -1354,7 +1618,7 @@
         </w:tblPrEx>
         <w:tc>
           <w:tcPr>
-            <w:tcW w:w="1200" w:type="dxa"/>
+            <w:tcW w:w="1097" w:type="dxa"/>
             <w:tcBorders>
               <w:top w:val="single" w:color="000000" w:sz="0" w:space="0"/>
               <w:left w:val="single" w:color="000000" w:sz="0" w:space="0"/>
@@ -1380,7 +1644,7 @@
         </w:tc>
         <w:tc>
           <w:tcPr>
-            <w:tcW w:w="1500" w:type="dxa"/>
+            <w:tcW w:w="1373" w:type="dxa"/>
             <w:tcBorders>
               <w:top w:val="single" w:color="000000" w:sz="0" w:space="0"/>
               <w:left w:val="single" w:color="000000" w:sz="0" w:space="0"/>
@@ -1406,7 +1670,7 @@
         </w:tc>
         <w:tc>
           <w:tcPr>
-            <w:tcW w:w="1800" w:type="dxa"/>
+            <w:tcW w:w="1641" w:type="dxa"/>
             <w:tcBorders>
               <w:top w:val="single" w:color="000000" w:sz="0" w:space="0"/>
               <w:left w:val="single" w:color="000000" w:sz="0" w:space="0"/>
@@ -1432,7 +1696,7 @@
         </w:tc>
         <w:tc>
           <w:tcPr>
-            <w:tcW w:w="4860" w:type="dxa"/>
+            <w:tcW w:w="4415" w:type="dxa"/>
             <w:tcBorders>
               <w:top w:val="single" w:color="000000" w:sz="0" w:space="0"/>
               <w:left w:val="single" w:color="000000" w:sz="0" w:space="0"/>
@@ -1458,6 +1722,32 @@
         </w:tc>
       </w:tr>
       <w:tr>
+        <w:tc>
+          <w:tcPr>
+            <w:tcW w:w="520" w:type="dxa"/>
+            <w:tcBorders>
+              <w:top w:val="single" w:color="000000" w:sz="0" w:space="0"/>
+              <w:left w:val="single" w:color="000000" w:sz="0" w:space="0"/>
+              <w:bottom w:val="single" w:color="000000" w:sz="0" w:space="0"/>
+              <w:right w:val="single" w:color="000000" w:sz="0" w:space="0"/>
+            </w:tcBorders>
+            <w:vAlign w:val="center"/>
+          </w:tcPr>
+          <w:p>
+            <w:pPr>
+              <w:spacing w:line="560" w:lineRule="exact"/>
+              <w:jc w:val="center"/>
+            </w:pPr>
+            <w:r>
+              <w:rPr>
+                <w:rFonts w:ascii="宋体" w:hAnsi="宋体" w:eastAsia="宋体" w:cs="宋体"/>
+                <w:sz w:val="24"/>
+                <w:szCs w:val="24"/>
+              </w:rPr>
+              <w:t xml:space="preserve">10</w:t>
+            </w:r>
+          </w:p>
+        </w:tc>
         <w:tblPrEx>
           <w:tblBorders>
             <w:top w:val="single" w:color="auto" w:sz="4" w:space="0"/>
@@ -1476,7 +1766,7 @@
         </w:tblPrEx>
         <w:tc>
           <w:tcPr>
-            <w:tcW w:w="1200" w:type="dxa"/>
+            <w:tcW w:w="1097" w:type="dxa"/>
             <w:tcBorders>
               <w:top w:val="single" w:color="000000" w:sz="0" w:space="0"/>
               <w:left w:val="single" w:color="000000" w:sz="0" w:space="0"/>
@@ -1502,7 +1792,7 @@
         </w:tc>
         <w:tc>
           <w:tcPr>
-            <w:tcW w:w="1500" w:type="dxa"/>
+            <w:tcW w:w="1373" w:type="dxa"/>
             <w:tcBorders>
               <w:top w:val="single" w:color="000000" w:sz="0" w:space="0"/>
               <w:left w:val="single" w:color="000000" w:sz="0" w:space="0"/>
@@ -1528,7 +1818,7 @@
         </w:tc>
         <w:tc>
           <w:tcPr>
-            <w:tcW w:w="1800" w:type="dxa"/>
+            <w:tcW w:w="1641" w:type="dxa"/>
             <w:tcBorders>
               <w:top w:val="single" w:color="000000" w:sz="0" w:space="0"/>
               <w:left w:val="single" w:color="000000" w:sz="0" w:space="0"/>
@@ -1554,7 +1844,7 @@
         </w:tc>
         <w:tc>
           <w:tcPr>
-            <w:tcW w:w="4860" w:type="dxa"/>
+            <w:tcW w:w="4415" w:type="dxa"/>
             <w:tcBorders>
               <w:top w:val="single" w:color="000000" w:sz="0" w:space="0"/>
               <w:left w:val="single" w:color="000000" w:sz="0" w:space="0"/>

</xml_diff>